<commit_message>
Allinea template di importazione a Odoo 20.0
- Conti bancari: account_number/holder_name/bank_name/bank_bic (res.bank
  non esiste più in 20): file istituti rimosso, unico 02_Conti_Bancari
- Dipendenti: employee_type_id (hr.employee.type), sex male/female,
  rimosso ssnid
- Manuale: riferimento 20.0 e tabella differenze 18/19/20

Co-Authored-By: Claude Opus 5.5 <noreply@anthropic.com>
Claude-Session: https://claude.ai/code/session_013waGJG7pYcG8W9mHUJy7ny
</commit_message>
<xml_diff>
--- a/import_templates/Manuale_Template_Import_Odoo.docx
+++ b/import_templates/Manuale_Template_Import_Odoo.docx
@@ -17,12 +17,12 @@
     </w:p>
     <w:p>
       <w:r>
-        <w:t>Versione di riferimento: Odoo 19 Enterprise (note per Odoo 18 al capitolo 9). Classificazione: Interno.</w:t>
+        <w:t>Versione di riferimento: Odoo 20.0 Enterprise (repository pixora/odoo, branch 20.0). Differenze con 18/19 al capitolo 9. Classificazione: Interno.</w:t>
       </w:r>
     </w:p>
     <w:p>
       <w:r>
-        <w:t>I nomi dei campi sono stati verificati sul sorgente Odoo e, per i moduli Enterprise (budget), sui metadati (fields_get) di un'istanza Odoo 19. Prima del go-live eseguire sempre un import di prova in un database di staging/test.</w:t>
+        <w:t>I nomi dei campi Community (contatti, conti bancari, dipendenti, piano dei conti) sono verificati sul sorgente Odoo 20.0 del repository. I modelli dei budget sono Enterprise e non sono nel repository: sono stati verificati su un'istanza Odoo 19 e vanno riconfermati su 20 con un import di prova. Prima del go-live eseguire sempre un import di prova in un database di staging/test.</w:t>
       </w:r>
     </w:p>
     <w:p>
@@ -160,48 +160,7 @@
               <w:rPr>
                 <w:sz w:val="18"/>
               </w:rPr>
-              <w:t>02a_Istituti_Bancari.xlsx</w:t>
-            </w:r>
-          </w:p>
-        </w:tc>
-        <w:tc>
-          <w:tcPr>
-            <w:tcW w:type="dxa" w:w="2880"/>
-          </w:tcPr>
-          <w:p>
-            <w:r>
-              <w:rPr>
-                <w:sz w:val="18"/>
-              </w:rPr>
-              <w:t>res.bank</w:t>
-            </w:r>
-          </w:p>
-        </w:tc>
-        <w:tc>
-          <w:tcPr>
-            <w:tcW w:type="dxa" w:w="2880"/>
-          </w:tcPr>
-          <w:p>
-            <w:r>
-              <w:rPr>
-                <w:sz w:val="18"/>
-              </w:rPr>
-              <w:t>Istituti bancari (anagrafica banche)</w:t>
-            </w:r>
-          </w:p>
-        </w:tc>
-      </w:tr>
-      <w:tr>
-        <w:tc>
-          <w:tcPr>
-            <w:tcW w:type="dxa" w:w="2880"/>
-          </w:tcPr>
-          <w:p>
-            <w:r>
-              <w:rPr>
-                <w:sz w:val="18"/>
-              </w:rPr>
-              <w:t>02b_Conti_Bancari.xlsx</w:t>
+              <w:t>02_Conti_Bancari.xlsx</w:t>
             </w:r>
           </w:p>
         </w:tc>
@@ -227,7 +186,7 @@
               <w:rPr>
                 <w:sz w:val="18"/>
               </w:rPr>
-              <w:t>Conti bancari (IBAN) di fornitori, dipendenti e azienda</w:t>
+              <w:t>Conti bancari (IBAN + banca) di fornitori, dipendenti e azienda</w:t>
             </w:r>
           </w:p>
         </w:tc>
@@ -1083,47 +1042,6 @@
               <w:rPr>
                 <w:sz w:val="18"/>
               </w:rPr>
-              <w:t>02a_Istituti_Bancari</w:t>
-            </w:r>
-          </w:p>
-        </w:tc>
-        <w:tc>
-          <w:tcPr>
-            <w:tcW w:type="dxa" w:w="2880"/>
-          </w:tcPr>
-          <w:p>
-            <w:r>
-              <w:rPr>
-                <w:sz w:val="18"/>
-              </w:rPr>
-              <w:t>Nessuno.</w:t>
-            </w:r>
-          </w:p>
-        </w:tc>
-      </w:tr>
-      <w:tr>
-        <w:tc>
-          <w:tcPr>
-            <w:tcW w:type="dxa" w:w="2880"/>
-          </w:tcPr>
-          <w:p>
-            <w:r>
-              <w:rPr>
-                <w:sz w:val="18"/>
-              </w:rPr>
-              <w:t>3</w:t>
-            </w:r>
-          </w:p>
-        </w:tc>
-        <w:tc>
-          <w:tcPr>
-            <w:tcW w:type="dxa" w:w="2880"/>
-          </w:tcPr>
-          <w:p>
-            <w:r>
-              <w:rPr>
-                <w:sz w:val="18"/>
-              </w:rPr>
               <w:t>01_Fornitori</w:t>
             </w:r>
           </w:p>
@@ -1152,7 +1070,7 @@
               <w:rPr>
                 <w:sz w:val="18"/>
               </w:rPr>
-              <w:t>4</w:t>
+              <w:t>3</w:t>
             </w:r>
           </w:p>
         </w:tc>
@@ -1165,7 +1083,7 @@
               <w:rPr>
                 <w:sz w:val="18"/>
               </w:rPr>
-              <w:t>02b_Conti_Bancari</w:t>
+              <w:t>02_Conti_Bancari</w:t>
             </w:r>
           </w:p>
         </w:tc>
@@ -1178,7 +1096,7 @@
               <w:rPr>
                 <w:sz w:val="18"/>
               </w:rPr>
-              <w:t>Fornitori (1) e istituti (2) già importati.</w:t>
+              <w:t>Fornitori (2) già importati.</w:t>
             </w:r>
           </w:p>
         </w:tc>
@@ -1193,7 +1111,7 @@
               <w:rPr>
                 <w:sz w:val="18"/>
               </w:rPr>
-              <w:t>5</w:t>
+              <w:t>4-5</w:t>
             </w:r>
           </w:p>
         </w:tc>
@@ -1451,28 +1369,12 @@
         <w:pStyle w:val="Heading2"/>
       </w:pPr>
       <w:r>
-        <w:t>5.2 Banche (02a + 02b)</w:t>
+        <w:t>5.2 Banche (02_Conti_Bancari.xlsx - res.partner.bank)</w:t>
       </w:r>
     </w:p>
     <w:p>
       <w:r>
-        <w:t>Due livelli distinti:</w:t>
-      </w:r>
-    </w:p>
-    <w:p>
-      <w:pPr>
-        <w:pStyle w:val="ListBullet"/>
-      </w:pPr>
-      <w:r>
-        <w:t>02a Istituti bancari (res.bank): l'anagrafica della banca (nome, BIC). Si carica una volta.</w:t>
-      </w:r>
-    </w:p>
-    <w:p>
-      <w:pPr>
-        <w:pStyle w:val="ListBullet"/>
-      </w:pPr>
-      <w:r>
-        <w:t>02b Conti bancari (res.partner.bank): l'IBAN, collegato a un titolare (fornitore, dipendente o azienda) e opzionalmente alla banca.</w:t>
+        <w:t>In Odoo 20 non esiste più un'anagrafica separata degli istituti bancari (modello res.bank): nome banca e BIC sono campi di testo direttamente sul conto bancario. Un unico file quindi carica IBAN + banca, collegati al titolare (fornitore, dipendente o azienda). Il paese del conto viene ricavato automaticamente dall'IBAN.</w:t>
       </w:r>
     </w:p>
     <w:p>
@@ -1480,7 +1382,7 @@
         <w:rPr>
           <w:b/>
         </w:rPr>
-        <w:t>Conti bancari dei DIPENDENTI (Odoo 19):</w:t>
+        <w:t>Conti bancari dei DIPENDENTI:</w:t>
       </w:r>
       <w:r/>
     </w:p>
@@ -1497,7 +1399,7 @@
         <w:pStyle w:val="ListNumber"/>
       </w:pPr>
       <w:r>
-        <w:t>Importare gli IBAN in 02b usando la colonna partner_id (senza /id) con il NOME del dipendente (Odoo crea per ogni dipendente un contatto con lo stesso nome).</w:t>
+        <w:t>Importare gli IBAN in 02_Conti_Bancari usando la colonna partner_id (senza /id) con il NOME del dipendente (Odoo crea per ogni dipendente un contatto con lo stesso nome).</w:t>
       </w:r>
     </w:p>
     <w:p>
@@ -1513,11 +1415,9 @@
         <w:rPr>
           <w:b/>
         </w:rPr>
-        <w:t xml:space="preserve">Nota. </w:t>
+        <w:t>Conti bancari dell'AZIENDA:</w:t>
       </w:r>
-      <w:r>
-        <w:t xml:space="preserve">Conti bancari dell'AZIENDA: </w:t>
-      </w:r>
+      <w:r/>
     </w:p>
     <w:p>
       <w:r>
@@ -1547,7 +1447,7 @@
         <w:pStyle w:val="ListBullet"/>
       </w:pPr>
       <w:r>
-        <w:t>In Odoo 19 i dati contrattuali/anagrafici sono "versionati" (hr.version): date_version indica da quando valgono. In import si può lasciare vuoto (= oggi) o mettere la data di assunzione.</w:t>
+        <w:t>In Odoo 20 i dati contrattuali/anagrafici sono "versionati" (hr.version): date_version indica da quando valgono. In import si può lasciare vuoto (= oggi) o mettere la data di assunzione.</w:t>
       </w:r>
     </w:p>
     <w:p>
@@ -1563,7 +1463,15 @@
         <w:pStyle w:val="ListBullet"/>
       </w:pPr>
       <w:r>
-        <w:t>Codice fiscale: convenzione consigliata nel campo identification_id.</w:t>
+        <w:t>Codice fiscale: convenzione consigliata nel campo identification_id (il campo ssnid non esiste più in Odoo 20).</w:t>
+      </w:r>
+    </w:p>
+    <w:p>
+      <w:pPr>
+        <w:pStyle w:val="ListBullet"/>
+      </w:pPr>
+      <w:r>
+        <w:t>Tipo dipendente: in Odoo 20 è un'anagrafica (employee_type_id) e non più un elenco fisso: usare gli ID del foglio Valori (es. hr.contract_type_employee).</w:t>
       </w:r>
     </w:p>
     <w:p>
@@ -2496,7 +2404,7 @@
         <w:pStyle w:val="Heading1"/>
       </w:pPr>
       <w:r>
-        <w:t>9. Differenze Odoo 18 / Odoo 19</w:t>
+        <w:t>9. Differenze tra versioni (18 / 19 / 20)</w:t>
       </w:r>
     </w:p>
     <w:tbl>
@@ -2506,14 +2414,15 @@
         <w:tblLook w:firstColumn="1" w:firstRow="1" w:lastColumn="0" w:lastRow="0" w:noHBand="0" w:noVBand="1" w:val="04A0"/>
       </w:tblPr>
       <w:tblGrid>
-        <w:gridCol w:w="2880"/>
-        <w:gridCol w:w="2880"/>
-        <w:gridCol w:w="2880"/>
+        <w:gridCol w:w="2160"/>
+        <w:gridCol w:w="2160"/>
+        <w:gridCol w:w="2160"/>
+        <w:gridCol w:w="2160"/>
       </w:tblGrid>
       <w:tr>
         <w:tc>
           <w:tcPr>
-            <w:tcW w:type="dxa" w:w="2880"/>
+            <w:tcW w:type="dxa" w:w="2160"/>
             <w:shd w:val="clear" w:color="auto" w:fill="2E5C8A"/>
           </w:tcPr>
           <w:p>
@@ -2534,7 +2443,7 @@
         </w:tc>
         <w:tc>
           <w:tcPr>
-            <w:tcW w:type="dxa" w:w="2880"/>
+            <w:tcW w:type="dxa" w:w="2160"/>
             <w:shd w:val="clear" w:color="auto" w:fill="2E5C8A"/>
           </w:tcPr>
           <w:p>
@@ -2555,7 +2464,7 @@
         </w:tc>
         <w:tc>
           <w:tcPr>
-            <w:tcW w:type="dxa" w:w="2880"/>
+            <w:tcW w:type="dxa" w:w="2160"/>
             <w:shd w:val="clear" w:color="auto" w:fill="2E5C8A"/>
           </w:tcPr>
           <w:p>
@@ -2574,11 +2483,248 @@
             </w:r>
           </w:p>
         </w:tc>
+        <w:tc>
+          <w:tcPr>
+            <w:tcW w:type="dxa" w:w="2160"/>
+            <w:shd w:val="clear" w:color="auto" w:fill="2E5C8A"/>
+          </w:tcPr>
+          <w:p>
+            <w:r>
+              <w:rPr>
+                <w:sz w:val="18"/>
+              </w:rPr>
+            </w:r>
+            <w:r>
+              <w:rPr>
+                <w:b/>
+                <w:color w:val="FFFFFF"/>
+                <w:sz w:val="18"/>
+              </w:rPr>
+              <w:t>Odoo 20 (questi template)</w:t>
+            </w:r>
+          </w:p>
+        </w:tc>
       </w:tr>
       <w:tr>
         <w:tc>
           <w:tcPr>
-            <w:tcW w:type="dxa" w:w="2880"/>
+            <w:tcW w:type="dxa" w:w="2160"/>
+          </w:tcPr>
+          <w:p>
+            <w:r>
+              <w:rPr>
+                <w:sz w:val="18"/>
+              </w:rPr>
+              <w:t>Anagrafica banche</w:t>
+            </w:r>
+          </w:p>
+        </w:tc>
+        <w:tc>
+          <w:tcPr>
+            <w:tcW w:type="dxa" w:w="2160"/>
+          </w:tcPr>
+          <w:p>
+            <w:r>
+              <w:rPr>
+                <w:sz w:val="18"/>
+              </w:rPr>
+              <w:t>res.bank + bank_id</w:t>
+            </w:r>
+          </w:p>
+        </w:tc>
+        <w:tc>
+          <w:tcPr>
+            <w:tcW w:type="dxa" w:w="2160"/>
+          </w:tcPr>
+          <w:p>
+            <w:r>
+              <w:rPr>
+                <w:sz w:val="18"/>
+              </w:rPr>
+              <w:t>res.bank + bank_id</w:t>
+            </w:r>
+          </w:p>
+        </w:tc>
+        <w:tc>
+          <w:tcPr>
+            <w:tcW w:type="dxa" w:w="2160"/>
+          </w:tcPr>
+          <w:p>
+            <w:r>
+              <w:rPr>
+                <w:sz w:val="18"/>
+              </w:rPr>
+              <w:t>non esiste: bank_name, bank_bic sul conto</w:t>
+            </w:r>
+          </w:p>
+        </w:tc>
+      </w:tr>
+      <w:tr>
+        <w:tc>
+          <w:tcPr>
+            <w:tcW w:type="dxa" w:w="2160"/>
+          </w:tcPr>
+          <w:p>
+            <w:r>
+              <w:rPr>
+                <w:sz w:val="18"/>
+              </w:rPr>
+              <w:t>Numero conto (IBAN)</w:t>
+            </w:r>
+          </w:p>
+        </w:tc>
+        <w:tc>
+          <w:tcPr>
+            <w:tcW w:type="dxa" w:w="2160"/>
+          </w:tcPr>
+          <w:p>
+            <w:r>
+              <w:rPr>
+                <w:sz w:val="18"/>
+              </w:rPr>
+              <w:t>acc_number</w:t>
+            </w:r>
+          </w:p>
+        </w:tc>
+        <w:tc>
+          <w:tcPr>
+            <w:tcW w:type="dxa" w:w="2160"/>
+          </w:tcPr>
+          <w:p>
+            <w:r>
+              <w:rPr>
+                <w:sz w:val="18"/>
+              </w:rPr>
+              <w:t>acc_number</w:t>
+            </w:r>
+          </w:p>
+        </w:tc>
+        <w:tc>
+          <w:tcPr>
+            <w:tcW w:type="dxa" w:w="2160"/>
+          </w:tcPr>
+          <w:p>
+            <w:r>
+              <w:rPr>
+                <w:sz w:val="18"/>
+              </w:rPr>
+              <w:t>account_number</w:t>
+            </w:r>
+          </w:p>
+        </w:tc>
+      </w:tr>
+      <w:tr>
+        <w:tc>
+          <w:tcPr>
+            <w:tcW w:type="dxa" w:w="2160"/>
+          </w:tcPr>
+          <w:p>
+            <w:r>
+              <w:rPr>
+                <w:sz w:val="18"/>
+              </w:rPr>
+              <w:t>Intestatario conto</w:t>
+            </w:r>
+          </w:p>
+        </w:tc>
+        <w:tc>
+          <w:tcPr>
+            <w:tcW w:type="dxa" w:w="2160"/>
+          </w:tcPr>
+          <w:p>
+            <w:r>
+              <w:rPr>
+                <w:sz w:val="18"/>
+              </w:rPr>
+              <w:t>acc_holder_name</w:t>
+            </w:r>
+          </w:p>
+        </w:tc>
+        <w:tc>
+          <w:tcPr>
+            <w:tcW w:type="dxa" w:w="2160"/>
+          </w:tcPr>
+          <w:p>
+            <w:r>
+              <w:rPr>
+                <w:sz w:val="18"/>
+              </w:rPr>
+              <w:t>acc_holder_name</w:t>
+            </w:r>
+          </w:p>
+        </w:tc>
+        <w:tc>
+          <w:tcPr>
+            <w:tcW w:type="dxa" w:w="2160"/>
+          </w:tcPr>
+          <w:p>
+            <w:r>
+              <w:rPr>
+                <w:sz w:val="18"/>
+              </w:rPr>
+              <w:t>holder_name</w:t>
+            </w:r>
+          </w:p>
+        </w:tc>
+      </w:tr>
+      <w:tr>
+        <w:tc>
+          <w:tcPr>
+            <w:tcW w:type="dxa" w:w="2160"/>
+          </w:tcPr>
+          <w:p>
+            <w:r>
+              <w:rPr>
+                <w:sz w:val="18"/>
+              </w:rPr>
+              <w:t>Valuta conto bancario</w:t>
+            </w:r>
+          </w:p>
+        </w:tc>
+        <w:tc>
+          <w:tcPr>
+            <w:tcW w:type="dxa" w:w="2160"/>
+          </w:tcPr>
+          <w:p>
+            <w:r>
+              <w:rPr>
+                <w:sz w:val="18"/>
+              </w:rPr>
+              <w:t>currency_id</w:t>
+            </w:r>
+          </w:p>
+        </w:tc>
+        <w:tc>
+          <w:tcPr>
+            <w:tcW w:type="dxa" w:w="2160"/>
+          </w:tcPr>
+          <w:p>
+            <w:r>
+              <w:rPr>
+                <w:sz w:val="18"/>
+              </w:rPr>
+              <w:t>currency_id</w:t>
+            </w:r>
+          </w:p>
+        </w:tc>
+        <w:tc>
+          <w:tcPr>
+            <w:tcW w:type="dxa" w:w="2160"/>
+          </w:tcPr>
+          <w:p>
+            <w:r>
+              <w:rPr>
+                <w:sz w:val="18"/>
+              </w:rPr>
+              <w:t>non presente</w:t>
+            </w:r>
+          </w:p>
+        </w:tc>
+      </w:tr>
+      <w:tr>
+        <w:tc>
+          <w:tcPr>
+            <w:tcW w:type="dxa" w:w="2160"/>
           </w:tcPr>
           <w:p>
             <w:r>
@@ -2591,7 +2737,7 @@
         </w:tc>
         <w:tc>
           <w:tcPr>
-            <w:tcW w:type="dxa" w:w="2880"/>
+            <w:tcW w:type="dxa" w:w="2160"/>
           </w:tcPr>
           <w:p>
             <w:r>
@@ -2604,14 +2750,27 @@
         </w:tc>
         <w:tc>
           <w:tcPr>
-            <w:tcW w:type="dxa" w:w="2880"/>
+            <w:tcW w:type="dxa" w:w="2160"/>
           </w:tcPr>
           <w:p>
             <w:r>
               <w:rPr>
                 <w:sz w:val="18"/>
               </w:rPr>
-              <w:t>sex</w:t>
+              <w:t>sex (male/female/other)</w:t>
+            </w:r>
+          </w:p>
+        </w:tc>
+        <w:tc>
+          <w:tcPr>
+            <w:tcW w:type="dxa" w:w="2160"/>
+          </w:tcPr>
+          <w:p>
+            <w:r>
+              <w:rPr>
+                <w:sz w:val="18"/>
+              </w:rPr>
+              <w:t>sex (male/female)</w:t>
             </w:r>
           </w:p>
         </w:tc>
@@ -2619,7 +2778,115 @@
       <w:tr>
         <w:tc>
           <w:tcPr>
-            <w:tcW w:type="dxa" w:w="2880"/>
+            <w:tcW w:type="dxa" w:w="2160"/>
+          </w:tcPr>
+          <w:p>
+            <w:r>
+              <w:rPr>
+                <w:sz w:val="18"/>
+              </w:rPr>
+              <w:t>Dipendente - tipo</w:t>
+            </w:r>
+          </w:p>
+        </w:tc>
+        <w:tc>
+          <w:tcPr>
+            <w:tcW w:type="dxa" w:w="2160"/>
+          </w:tcPr>
+          <w:p>
+            <w:r>
+              <w:rPr>
+                <w:sz w:val="18"/>
+              </w:rPr>
+              <w:t>employee_type (elenco)</w:t>
+            </w:r>
+          </w:p>
+        </w:tc>
+        <w:tc>
+          <w:tcPr>
+            <w:tcW w:type="dxa" w:w="2160"/>
+          </w:tcPr>
+          <w:p>
+            <w:r>
+              <w:rPr>
+                <w:sz w:val="18"/>
+              </w:rPr>
+              <w:t>employee_type (elenco)</w:t>
+            </w:r>
+          </w:p>
+        </w:tc>
+        <w:tc>
+          <w:tcPr>
+            <w:tcW w:type="dxa" w:w="2160"/>
+          </w:tcPr>
+          <w:p>
+            <w:r>
+              <w:rPr>
+                <w:sz w:val="18"/>
+              </w:rPr>
+              <w:t>employee_type_id (anagrafica)</w:t>
+            </w:r>
+          </w:p>
+        </w:tc>
+      </w:tr>
+      <w:tr>
+        <w:tc>
+          <w:tcPr>
+            <w:tcW w:type="dxa" w:w="2160"/>
+          </w:tcPr>
+          <w:p>
+            <w:r>
+              <w:rPr>
+                <w:sz w:val="18"/>
+              </w:rPr>
+              <w:t>Dipendente - n. previdenziale</w:t>
+            </w:r>
+          </w:p>
+        </w:tc>
+        <w:tc>
+          <w:tcPr>
+            <w:tcW w:type="dxa" w:w="2160"/>
+          </w:tcPr>
+          <w:p>
+            <w:r>
+              <w:rPr>
+                <w:sz w:val="18"/>
+              </w:rPr>
+              <w:t>ssnid</w:t>
+            </w:r>
+          </w:p>
+        </w:tc>
+        <w:tc>
+          <w:tcPr>
+            <w:tcW w:type="dxa" w:w="2160"/>
+          </w:tcPr>
+          <w:p>
+            <w:r>
+              <w:rPr>
+                <w:sz w:val="18"/>
+              </w:rPr>
+              <w:t>ssnid</w:t>
+            </w:r>
+          </w:p>
+        </w:tc>
+        <w:tc>
+          <w:tcPr>
+            <w:tcW w:type="dxa" w:w="2160"/>
+          </w:tcPr>
+          <w:p>
+            <w:r>
+              <w:rPr>
+                <w:sz w:val="18"/>
+              </w:rPr>
+              <w:t>non presente</w:t>
+            </w:r>
+          </w:p>
+        </w:tc>
+      </w:tr>
+      <w:tr>
+        <w:tc>
+          <w:tcPr>
+            <w:tcW w:type="dxa" w:w="2160"/>
           </w:tcPr>
           <w:p>
             <w:r>
@@ -2632,20 +2899,33 @@
         </w:tc>
         <w:tc>
           <w:tcPr>
-            <w:tcW w:type="dxa" w:w="2880"/>
+            <w:tcW w:type="dxa" w:w="2160"/>
           </w:tcPr>
           <w:p>
             <w:r>
               <w:rPr>
                 <w:sz w:val="18"/>
               </w:rPr>
-              <w:t>bank_account_id (uno solo)</w:t>
+              <w:t>bank_account_id (uno)</w:t>
             </w:r>
           </w:p>
         </w:tc>
         <w:tc>
           <w:tcPr>
-            <w:tcW w:type="dxa" w:w="2880"/>
+            <w:tcW w:type="dxa" w:w="2160"/>
+          </w:tcPr>
+          <w:p>
+            <w:r>
+              <w:rPr>
+                <w:sz w:val="18"/>
+              </w:rPr>
+              <w:t>bank_account_ids (più conti)</w:t>
+            </w:r>
+          </w:p>
+        </w:tc>
+        <w:tc>
+          <w:tcPr>
+            <w:tcW w:type="dxa" w:w="2160"/>
           </w:tcPr>
           <w:p>
             <w:r>
@@ -2660,7 +2940,7 @@
       <w:tr>
         <w:tc>
           <w:tcPr>
-            <w:tcW w:type="dxa" w:w="2880"/>
+            <w:tcW w:type="dxa" w:w="2160"/>
           </w:tcPr>
           <w:p>
             <w:r>
@@ -2673,7 +2953,7 @@
         </w:tc>
         <w:tc>
           <w:tcPr>
-            <w:tcW w:type="dxa" w:w="2880"/>
+            <w:tcW w:type="dxa" w:w="2160"/>
           </w:tcPr>
           <w:p>
             <w:r>
@@ -2686,14 +2966,27 @@
         </w:tc>
         <w:tc>
           <w:tcPr>
-            <w:tcW w:type="dxa" w:w="2880"/>
+            <w:tcW w:type="dxa" w:w="2160"/>
           </w:tcPr>
           <w:p>
             <w:r>
               <w:rPr>
                 <w:sz w:val="18"/>
               </w:rPr>
-              <w:t>date_version (hr.version)</w:t>
+              <w:t>date_version</w:t>
+            </w:r>
+          </w:p>
+        </w:tc>
+        <w:tc>
+          <w:tcPr>
+            <w:tcW w:type="dxa" w:w="2160"/>
+          </w:tcPr>
+          <w:p>
+            <w:r>
+              <w:rPr>
+                <w:sz w:val="18"/>
+              </w:rPr>
+              <w:t>date_version</w:t>
             </w:r>
           </w:p>
         </w:tc>
@@ -2701,48 +2994,7 @@
       <w:tr>
         <w:tc>
           <w:tcPr>
-            <w:tcW w:type="dxa" w:w="2880"/>
-          </w:tcPr>
-          <w:p>
-            <w:r>
-              <w:rPr>
-                <w:sz w:val="18"/>
-              </w:rPr>
-              <w:t>Conto bancario</w:t>
-            </w:r>
-          </w:p>
-        </w:tc>
-        <w:tc>
-          <w:tcPr>
-            <w:tcW w:type="dxa" w:w="2880"/>
-          </w:tcPr>
-          <w:p>
-            <w:r>
-              <w:rPr>
-                <w:sz w:val="18"/>
-              </w:rPr>
-              <w:t>acc_number, bank_id</w:t>
-            </w:r>
-          </w:p>
-        </w:tc>
-        <w:tc>
-          <w:tcPr>
-            <w:tcW w:type="dxa" w:w="2880"/>
-          </w:tcPr>
-          <w:p>
-            <w:r>
-              <w:rPr>
-                <w:sz w:val="18"/>
-              </w:rPr>
-              <w:t>acc_number, bank_id (invariato)</w:t>
-            </w:r>
-          </w:p>
-        </w:tc>
-      </w:tr>
-      <w:tr>
-        <w:tc>
-          <w:tcPr>
-            <w:tcW w:type="dxa" w:w="2880"/>
+            <w:tcW w:type="dxa" w:w="2160"/>
           </w:tcPr>
           <w:p>
             <w:r>
@@ -2755,7 +3007,7 @@
         </w:tc>
         <w:tc>
           <w:tcPr>
-            <w:tcW w:type="dxa" w:w="2880"/>
+            <w:tcW w:type="dxa" w:w="2160"/>
           </w:tcPr>
           <w:p>
             <w:r>
@@ -2768,7 +3020,7 @@
         </w:tc>
         <w:tc>
           <w:tcPr>
-            <w:tcW w:type="dxa" w:w="2880"/>
+            <w:tcW w:type="dxa" w:w="2160"/>
           </w:tcPr>
           <w:p>
             <w:r>
@@ -2779,12 +3031,25 @@
             </w:r>
           </w:p>
         </w:tc>
+        <w:tc>
+          <w:tcPr>
+            <w:tcW w:type="dxa" w:w="2160"/>
+          </w:tcPr>
+          <w:p>
+            <w:r>
+              <w:rPr>
+                <w:sz w:val="18"/>
+              </w:rPr>
+              <w:t>da riconfermare (Enterprise)</w:t>
+            </w:r>
+          </w:p>
+        </w:tc>
       </w:tr>
     </w:tbl>
     <w:p/>
     <w:p>
       <w:r>
-        <w:t>In Odoo 18 rinominare le colonne del file dipendenti come da tabella. Le versioni successive (20+) cambiano ulteriormente i conti bancari (es. account_number): rigenerare i template con lo script adattato.</w:t>
+        <w:t>Per usare i template su un database 18 o 19 rinominare le colonne come da tabella (o adattare genera_template.py e rigenerare).</w:t>
       </w:r>
     </w:p>
     <w:p>

</xml_diff>

<commit_message>
Manuale: budget analitico confermato su Odoo 20 dal modulo demo-alina
Co-Authored-By: Claude Opus 5.5 <noreply@anthropic.com>
Claude-Session: https://claude.ai/code/session_013waGJG7pYcG8W9mHUJy7ny
</commit_message>
<xml_diff>
--- a/import_templates/Manuale_Template_Import_Odoo.docx
+++ b/import_templates/Manuale_Template_Import_Odoo.docx
@@ -22,7 +22,7 @@
     </w:p>
     <w:p>
       <w:r>
-        <w:t>I nomi dei campi Community (contatti, conti bancari, dipendenti, piano dei conti) sono verificati sul sorgente Odoo 20.0 del repository. I modelli dei budget sono Enterprise e non sono nel repository: sono stati verificati su un'istanza Odoo 19 e vanno riconfermati su 20 con un import di prova. Prima del go-live eseguire sempre un import di prova in un database di staging/test.</w:t>
+        <w:t>I nomi dei campi Community (contatti, conti bancari, dipendenti, piano dei conti) sono verificati sul sorgente Odoo 20.0 del repository. Il budget analitico (budget.analytic, Enterprise) è confermato su Odoo 20 dal modulo demo pix_demo_family_office (repo pixora/demo-alina); il budget finanziario (account.report.budget) è verificato su Odoo 19 e va riconfermato su 20 con un import di prova. Prima del go-live eseguire sempre un import di prova in un database di staging/test.</w:t>
       </w:r>
     </w:p>
     <w:p>
@@ -3001,7 +3001,7 @@
               <w:rPr>
                 <w:sz w:val="18"/>
               </w:rPr>
-              <w:t>Budget analitico / finanziario</w:t>
+              <w:t>Budget analitico</w:t>
             </w:r>
           </w:p>
         </w:tc>
@@ -3014,7 +3014,7 @@
               <w:rPr>
                 <w:sz w:val="18"/>
               </w:rPr>
-              <w:t>budget.analytic / account.report.budget</w:t>
+              <w:t>budget.analytic</w:t>
             </w:r>
           </w:p>
         </w:tc>
@@ -3027,7 +3027,7 @@
               <w:rPr>
                 <w:sz w:val="18"/>
               </w:rPr>
-              <w:t>invariati</w:t>
+              <w:t>invariato</w:t>
             </w:r>
           </w:p>
         </w:tc>
@@ -3040,7 +3040,61 @@
               <w:rPr>
                 <w:sz w:val="18"/>
               </w:rPr>
-              <w:t>da riconfermare (Enterprise)</w:t>
+              <w:t>invariato (confermato da modulo demo 20.0)</w:t>
+            </w:r>
+          </w:p>
+        </w:tc>
+      </w:tr>
+      <w:tr>
+        <w:tc>
+          <w:tcPr>
+            <w:tcW w:type="dxa" w:w="2160"/>
+          </w:tcPr>
+          <w:p>
+            <w:r>
+              <w:rPr>
+                <w:sz w:val="18"/>
+              </w:rPr>
+              <w:t>Budget finanziario</w:t>
+            </w:r>
+          </w:p>
+        </w:tc>
+        <w:tc>
+          <w:tcPr>
+            <w:tcW w:type="dxa" w:w="2160"/>
+          </w:tcPr>
+          <w:p>
+            <w:r>
+              <w:rPr>
+                <w:sz w:val="18"/>
+              </w:rPr>
+              <w:t>account.report.budget</w:t>
+            </w:r>
+          </w:p>
+        </w:tc>
+        <w:tc>
+          <w:tcPr>
+            <w:tcW w:type="dxa" w:w="2160"/>
+          </w:tcPr>
+          <w:p>
+            <w:r>
+              <w:rPr>
+                <w:sz w:val="18"/>
+              </w:rPr>
+              <w:t>invariato</w:t>
+            </w:r>
+          </w:p>
+        </w:tc>
+        <w:tc>
+          <w:tcPr>
+            <w:tcW w:type="dxa" w:w="2160"/>
+          </w:tcPr>
+          <w:p>
+            <w:r>
+              <w:rPr>
+                <w:sz w:val="18"/>
+              </w:rPr>
+              <w:t>da riconfermare con import di prova</w:t>
             </w:r>
           </w:p>
         </w:tc>

</xml_diff>